<commit_message>
Phase 3 SRS v1.2: correct Section 4 headings and align the function map
- Add the missing commas and hyphens to the Section 4.6, 4.7, 4.8, 4.9
  and 4.11 feature headings.
- Make the Section 2.2 function table use the exact Section 4 titles, so the
  map it promises is accurate.
- Bring the Section 4.3 Phase 1 citation into line with the other ten.

FR-TRANSFER-006 is left as a single requirement to avoid renumbering the
transfer requirements, which are referenced elsewhere.
</commit_message>
<xml_diff>
--- a/docs/phase-3/COSC336_Group6_Phase3_SRS_v1.2.docx
+++ b/docs/phase-3/COSC336_Group6_Phase3_SRS_v1.2.docx
@@ -7433,7 +7433,7 @@
               <w:rPr>
                 <w:sz w:val="20"/>
               </w:rPr>
-              <w:t>User, department and access management</w:t>
+              <w:t>User and Access Management</w:t>
             </w:r>
           </w:p>
         </w:tc>
@@ -7485,7 +7485,7 @@
               <w:rPr>
                 <w:sz w:val="20"/>
               </w:rPr>
-              <w:t>Asset registration and publication</w:t>
+              <w:t>Asset Registration and Publication</w:t>
             </w:r>
           </w:p>
         </w:tc>
@@ -7537,7 +7537,7 @@
               <w:rPr>
                 <w:sz w:val="20"/>
               </w:rPr>
-              <w:t>Search and filtering</w:t>
+              <w:t>Resource Search and Filtering</w:t>
             </w:r>
           </w:p>
         </w:tc>
@@ -7589,7 +7589,7 @@
               <w:rPr>
                 <w:sz w:val="20"/>
               </w:rPr>
-              <w:t>Resource requests and reservations</w:t>
+              <w:t>Resource Requests and Reservations</w:t>
             </w:r>
           </w:p>
         </w:tc>
@@ -7641,7 +7641,7 @@
               <w:rPr>
                 <w:sz w:val="20"/>
               </w:rPr>
-              <w:t>Approval and transfer management</w:t>
+              <w:t>Approval and Transfer Management</w:t>
             </w:r>
           </w:p>
         </w:tc>
@@ -7693,7 +7693,7 @@
               <w:rPr>
                 <w:sz w:val="20"/>
               </w:rPr>
-              <w:t>Inspection, maintenance, repair and life-cycle tracking</w:t>
+              <w:t>Inspection, Maintenance, Repair and Life-Cycle Tracking</w:t>
             </w:r>
           </w:p>
         </w:tc>
@@ -7745,7 +7745,7 @@
               <w:rPr>
                 <w:sz w:val="20"/>
               </w:rPr>
-              <w:t>AI-assisted asset classification</w:t>
+              <w:t>AI-Assisted Asset Classification</w:t>
             </w:r>
           </w:p>
         </w:tc>
@@ -7797,7 +7797,7 @@
               <w:rPr>
                 <w:sz w:val="20"/>
               </w:rPr>
-              <w:t>AI matching, ranking and explanations</w:t>
+              <w:t>AI Resource Matching, Ranking and Explanations</w:t>
             </w:r>
           </w:p>
         </w:tc>
@@ -7849,7 +7849,7 @@
               <w:rPr>
                 <w:sz w:val="20"/>
               </w:rPr>
-              <w:t>Sustainable-action recommendations</w:t>
+              <w:t>Sustainable-Action Recommendations</w:t>
             </w:r>
           </w:p>
         </w:tc>
@@ -7901,7 +7901,7 @@
               <w:rPr>
                 <w:sz w:val="20"/>
               </w:rPr>
-              <w:t>Conversational assistant</w:t>
+              <w:t>Natural Language Assistant</w:t>
             </w:r>
           </w:p>
         </w:tc>
@@ -7953,7 +7953,7 @@
               <w:rPr>
                 <w:sz w:val="20"/>
               </w:rPr>
-              <w:t>Reporting, notifications and auditability</w:t>
+              <w:t>Reporting, Notifications and Auditability</w:t>
             </w:r>
           </w:p>
         </w:tc>
@@ -10819,7 +10819,7 @@
         <w:spacing w:after="60" w:line="260" w:lineRule="exact"/>
       </w:pPr>
       <w:r>
-        <w:t>Priority: High. Provide conventional discovery and the non-AI search baseline (Phase 1, Req. 13).</w:t>
+        <w:t>Priority: High. Provide conventional discovery and the non-AI search baseline (Phase 1, Section 4.3).</w:t>
       </w:r>
     </w:p>
     <w:p>
@@ -11706,7 +11706,7 @@
       <w:bookmarkStart w:id="50" w:name="SRS_1025"/>
       <w:bookmarkStart w:id="51" w:name="_Toc242755169"/>
       <w:r>
-        <w:t>4.6 Inspection Maintenance Repair and Life Cycle Tracking</w:t>
+        <w:t>4.6 Inspection, Maintenance, Repair and Life-Cycle Tracking</w:t>
       </w:r>
       <w:bookmarkEnd w:id="50"/>
       <w:bookmarkEnd w:id="51"/>
@@ -11965,7 +11965,7 @@
       <w:bookmarkStart w:id="52" w:name="SRS_1026"/>
       <w:bookmarkStart w:id="53" w:name="_Toc242755170"/>
       <w:r>
-        <w:t>4.7 AI Assisted Asset Classification</w:t>
+        <w:t>4.7 AI-Assisted Asset Classification</w:t>
       </w:r>
       <w:bookmarkEnd w:id="52"/>
       <w:bookmarkEnd w:id="53"/>
@@ -12163,7 +12163,7 @@
       <w:bookmarkStart w:id="54" w:name="SRS_1027"/>
       <w:bookmarkStart w:id="55" w:name="_Toc242755171"/>
       <w:r>
-        <w:t>4.8 AI Resource Matching Ranking and Explanations</w:t>
+        <w:t>4.8 AI Resource Matching, Ranking and Explanations</w:t>
       </w:r>
       <w:bookmarkEnd w:id="54"/>
       <w:bookmarkEnd w:id="55"/>
@@ -12626,7 +12626,7 @@
       <w:bookmarkStart w:id="56" w:name="SRS_1028"/>
       <w:bookmarkStart w:id="57" w:name="_Toc242755172"/>
       <w:r>
-        <w:t>4.9 Sustainable Action Recommendations</w:t>
+        <w:t>4.9 Sustainable-Action Recommendations</w:t>
       </w:r>
       <w:bookmarkEnd w:id="56"/>
       <w:bookmarkEnd w:id="57"/>
@@ -13064,7 +13064,7 @@
       <w:bookmarkStart w:id="60" w:name="SRS_1030"/>
       <w:bookmarkStart w:id="61" w:name="_Toc242755174"/>
       <w:r>
-        <w:t>4.11 Reporting Notifications and Auditability</w:t>
+        <w:t>4.11 Reporting, Notifications and Auditability</w:t>
       </w:r>
       <w:bookmarkEnd w:id="60"/>
       <w:bookmarkEnd w:id="61"/>

</xml_diff>

<commit_message>
Phase 3 SRS v1.2: label the privacy requirements and split NFR-PERF-001
- Give NFR-PRIV-001 and NFR-PRIV-002 the Privacy run-in label that
  Section 5.4 already uses for its categories. They sit under 5.3 Security
  Requirements because the template has no privacy subsection, so the label
  is the only way a reader can tell they are not security requirements.
- Break NFR-PERF-001 into separate sentences for the requirement, the test
  declaration and the dataset size.
- Restore the requirement-level precision in the Section 4.3 citation, which
  now reads (Phase 1, Section 4.3, Req. 13).
</commit_message>
<xml_diff>
--- a/docs/phase-3/COSC336_Group6_Phase3_SRS_v1.2.docx
+++ b/docs/phase-3/COSC336_Group6_Phase3_SRS_v1.2.docx
@@ -10819,7 +10819,7 @@
         <w:spacing w:after="60" w:line="260" w:lineRule="exact"/>
       </w:pPr>
       <w:r>
-        <w:t>Priority: High. Provide conventional discovery and the non-AI search baseline (Phase 1, Section 4.3).</w:t>
+        <w:t>Priority: High. Provide conventional discovery and the non-AI search baseline (Phase 1, Section 4.3, Req. 13).</w:t>
       </w:r>
     </w:p>
     <w:p>
@@ -13467,7 +13467,7 @@
         <w:rPr>
           <w:sz w:val="21"/>
         </w:rPr>
-        <w:t>Ordinary filtered searches shall complete within 2 seconds for at least 95% of measured requests with five simultaneous user sessions (Phase 1, Req. 56). The test shall declare dataset size, query mix, network, browser and hosting environment; the Phase 2 planning dataset is approximately 5,000 asset records, including 500 published listings.</w:t>
+        <w:t>Ordinary filtered searches shall complete within 2 seconds for at least 95% of measured requests with five simultaneous user sessions (Phase 1, Req. 56). The test shall declare dataset size, query mix, network, browser and hosting environment. The Phase 2 planning dataset is approximately 5,000 asset records, including 500 published listings.</w:t>
       </w:r>
       <w:r>
         <w:rPr>
@@ -13764,7 +13764,7 @@
           <w:b/>
           <w:sz w:val="21"/>
         </w:rPr>
-        <w:t xml:space="preserve">NFR-PRIV-001  </w:t>
+        <w:t xml:space="preserve">NFR-PRIV-001 Privacy  </w:t>
       </w:r>
       <w:r>
         <w:rPr>
@@ -13795,7 +13795,7 @@
           <w:b/>
           <w:sz w:val="21"/>
         </w:rPr>
-        <w:t xml:space="preserve">NFR-PRIV-002  </w:t>
+        <w:t xml:space="preserve">NFR-PRIV-002 Privacy  </w:t>
       </w:r>
       <w:r>
         <w:rPr>

</xml_diff>

<commit_message>
Phase 3 SRS v1.2: apply the document-wide requirement format to Section 3
UI, SI and CI requirements were a single plain run, while the other 105
requirements in the document use a bold identifier followed by a bold
Acceptance or Verification label. Give the six Section 3 requirements the
same treatment. Wording is unchanged.
</commit_message>
<xml_diff>
--- a/docs/phase-3/COSC336_Group6_Phase3_SRS_v1.2.docx
+++ b/docs/phase-3/COSC336_Group6_Phase3_SRS_v1.2.docx
@@ -10125,7 +10125,28 @@
         <w:spacing w:after="60" w:line="260" w:lineRule="exact"/>
       </w:pPr>
       <w:r>
-        <w:t>UI-001 The system shall provide sign-in, role-appropriate navigation, asset registration and editing, and marketplace search. It shall provide areas for request and reservation status, approvals, transfers and receipts, maintenance records, and sustainable-action review. Assistant interaction and reporting complete the set. Forms shall show required fields, preserve invalid input and explain correction steps (FR-ASSET-005, FR-REQUEST-002, NFR-QUAL-002). Verification: complete each role's permitted workflows and confirm denied actions are unavailable and rejected on direct access.</w:t>
+        <w:rPr>
+          <w:b/>
+        </w:rPr>
+        <w:t xml:space="preserve">UI-001  </w:t>
+      </w:r>
+      <w:r>
+        <w:rPr>
+          <w:b w:val="0"/>
+        </w:rPr>
+        <w:t xml:space="preserve">The system shall provide sign-in, role-appropriate navigation, asset registration and editing, and marketplace search. It shall provide areas for request and reservation status, approvals, transfers and receipts, maintenance records, and sustainable-action review. Assistant interaction and reporting complete the set. Forms shall show required fields, preserve invalid input and explain correction steps (FR-ASSET-005, FR-REQUEST-002, NFR-QUAL-002). </w:t>
+      </w:r>
+      <w:r>
+        <w:rPr>
+          <w:b/>
+        </w:rPr>
+        <w:t xml:space="preserve"> Verification: </w:t>
+      </w:r>
+      <w:r>
+        <w:rPr>
+          <w:b w:val="0"/>
+        </w:rPr>
+        <w:t>complete each role's permitted workflows and confirm denied actions are unavailable and rejected on direct access.</w:t>
       </w:r>
     </w:p>
     <w:p>
@@ -10133,7 +10154,28 @@
         <w:spacing w:after="60" w:line="260" w:lineRule="exact"/>
       </w:pPr>
       <w:r>
-        <w:t>UI-002 The system shall visibly distinguish confirmed asset data from AI suggestions, show processing/error states and uncertainty, and require user review before submitting assistant-prepared requests. Quantity and status views shall distinguish available, reserved, in-transit, received and unfit portions. Verification: review normal, partial, missing-data and AI-outage scenarios. Detailed screen mockups belong to Phase 4.</w:t>
+        <w:rPr>
+          <w:b/>
+        </w:rPr>
+        <w:t xml:space="preserve">UI-002  </w:t>
+      </w:r>
+      <w:r>
+        <w:rPr>
+          <w:b w:val="0"/>
+        </w:rPr>
+        <w:t xml:space="preserve">The system shall visibly distinguish confirmed asset data from AI suggestions, show processing/error states and uncertainty, and require user review before submitting assistant-prepared requests. Quantity and status views shall distinguish available, reserved, in-transit, received and unfit portions. </w:t>
+      </w:r>
+      <w:r>
+        <w:rPr>
+          <w:b/>
+        </w:rPr>
+        <w:t xml:space="preserve"> Verification: </w:t>
+      </w:r>
+      <w:r>
+        <w:rPr>
+          <w:b w:val="0"/>
+        </w:rPr>
+        <w:t>review normal, partial, missing-data and AI-outage scenarios. Detailed screen mockups belong to Phase 4.</w:t>
       </w:r>
     </w:p>
     <w:p>
@@ -10177,7 +10219,28 @@
         <w:spacing w:after="60" w:line="260" w:lineRule="exact"/>
       </w:pPr>
       <w:r>
-        <w:t>SI-001 The application shall exchange account/session data with its authentication service; asset, request, allocation, approval, transfer, maintenance and audit records with persistent storage; and asset files with file storage. The browser shall not receive service credentials. Verification: access, persistence and unauthorized-access tests (NFR-SEC-001 to 003, NFR-QUAL-003). No institutional-system interface is included.</w:t>
+        <w:rPr>
+          <w:b/>
+        </w:rPr>
+        <w:t xml:space="preserve">SI-001  </w:t>
+      </w:r>
+      <w:r>
+        <w:rPr>
+          <w:b w:val="0"/>
+        </w:rPr>
+        <w:t xml:space="preserve">The application shall exchange account/session data with its authentication service; asset, request, allocation, approval, transfer, maintenance and audit records with persistent storage; and asset files with file storage. The browser shall not receive service credentials. </w:t>
+      </w:r>
+      <w:r>
+        <w:rPr>
+          <w:b/>
+        </w:rPr>
+        <w:t xml:space="preserve"> Verification: </w:t>
+      </w:r>
+      <w:r>
+        <w:rPr>
+          <w:b w:val="0"/>
+        </w:rPr>
+        <w:t>access, persistence and unauthorized-access tests (NFR-SEC-001 to 003, NFR-QUAL-003). No institutional-system interface is included.</w:t>
       </w:r>
     </w:p>
     <w:p>
@@ -10185,7 +10248,28 @@
         <w:spacing w:after="60" w:line="260" w:lineRule="exact"/>
       </w:pPr>
       <w:r>
-        <w:t>SI-002 Server-side AI requests shall contain only task-required permitted information. Classification receives supplied asset metadata and files; matching receives request and listing data; action recommendations receive asset history, costs and demand; the assistant receives accessible records and policy; report summaries receive computed report data. Responses shall be treated as suggestions and validated before use. Verification: inspect request and response content, invalid-output handling and AI-disabled fallback. Phase 2 proposed React and TypeScript, Cloudflare hosting, Supabase and Gemini. Provider versions, APIs and final implementation choices are design decisions subject to TBD-001.</w:t>
+        <w:rPr>
+          <w:b/>
+        </w:rPr>
+        <w:t xml:space="preserve">SI-002  </w:t>
+      </w:r>
+      <w:r>
+        <w:rPr>
+          <w:b w:val="0"/>
+        </w:rPr>
+        <w:t xml:space="preserve">Server-side AI requests shall contain only task-required permitted information. Classification receives supplied asset metadata and files; matching receives request and listing data; action recommendations receive asset history, costs and demand; the assistant receives accessible records and policy; report summaries receive computed report data. Responses shall be treated as suggestions and validated before use. </w:t>
+      </w:r>
+      <w:r>
+        <w:rPr>
+          <w:b/>
+        </w:rPr>
+        <w:t xml:space="preserve"> Verification: </w:t>
+      </w:r>
+      <w:r>
+        <w:rPr>
+          <w:b w:val="0"/>
+        </w:rPr>
+        <w:t>inspect request and response content, invalid-output handling and AI-disabled fallback. Phase 2 proposed React and TypeScript, Cloudflare hosting, Supabase and Gemini. Provider versions, APIs and final implementation choices are design decisions subject to TBD-001.</w:t>
       </w:r>
     </w:p>
     <w:p>
@@ -10205,7 +10289,28 @@
         <w:spacing w:after="60" w:line="260" w:lineRule="exact"/>
       </w:pPr>
       <w:r>
-        <w:t>CI-001 Browser/server and external-service traffic shall use encrypted connections. Protected operations shall require authentication and authorization; transfer or reservation confirmations shall not be duplicated by a retry, and failures shall not leave partly applied records (NFR-SEC-001/002, NFR-QUAL-003). Verification: configuration review, denied-access tests and interrupted/retried transaction tests.</w:t>
+        <w:rPr>
+          <w:b/>
+        </w:rPr>
+        <w:t xml:space="preserve">CI-001  </w:t>
+      </w:r>
+      <w:r>
+        <w:rPr>
+          <w:b w:val="0"/>
+        </w:rPr>
+        <w:t xml:space="preserve">Browser/server and external-service traffic shall use encrypted connections. Protected operations shall require authentication and authorization; transfer or reservation confirmations shall not be duplicated by a retry, and failures shall not leave partly applied records (NFR-SEC-001/002, NFR-QUAL-003). </w:t>
+      </w:r>
+      <w:r>
+        <w:rPr>
+          <w:b/>
+        </w:rPr>
+        <w:t xml:space="preserve"> Verification: </w:t>
+      </w:r>
+      <w:r>
+        <w:rPr>
+          <w:b w:val="0"/>
+        </w:rPr>
+        <w:t>configuration review, denied-access tests and interrupted/retried transaction tests.</w:t>
       </w:r>
     </w:p>
     <w:p>
@@ -10213,7 +10318,28 @@
         <w:spacing w:after="60" w:line="260" w:lineRule="exact"/>
       </w:pPr>
       <w:r>
-        <w:t>CI-002 Notifications shall be in-application records with a permitted link and required action (FR-REPORT-006 to 008). Network or notification failure shall preserve saved business records and display an appropriate status. Email, SMS and live institutional messaging are not required prototype interfaces. Verification: simulate loss of connection and notification delivery failure.</w:t>
+        <w:rPr>
+          <w:b/>
+        </w:rPr>
+        <w:t xml:space="preserve">CI-002  </w:t>
+      </w:r>
+      <w:r>
+        <w:rPr>
+          <w:b w:val="0"/>
+        </w:rPr>
+        <w:t xml:space="preserve">Notifications shall be in-application records with a permitted link and required action (FR-REPORT-006 to 008). Network or notification failure shall preserve saved business records and display an appropriate status. Email, SMS and live institutional messaging are not required prototype interfaces. </w:t>
+      </w:r>
+      <w:r>
+        <w:rPr>
+          <w:b/>
+        </w:rPr>
+        <w:t xml:space="preserve"> Verification: </w:t>
+      </w:r>
+      <w:r>
+        <w:rPr>
+          <w:b w:val="0"/>
+        </w:rPr>
+        <w:t>simulate loss of connection and notification delivery failure.</w:t>
       </w:r>
     </w:p>
     <w:p>

</xml_diff>

<commit_message>
Phase 3 SRS v1.2: split AI-REQ-007 and align the sustainability measures
- Split the semicolon-joined pair in AI-REQ-007 so the classification check
  and the sustainable-action, assistant and report checks each read as their
  own sentence. It was the second longest requirement in the document.
- Bold the 'Verify' label on SUS-001 to SUS-007 so the seven sustainability
  measures match the bold 'Verification:' label used by the other
  requirements. Wording is unchanged.

All 111 requirements now share one presentation convention: bold identifier,
plain text, bold check label.
</commit_message>
<xml_diff>
--- a/docs/phase-3/COSC336_Group6_Phase3_SRS_v1.2.docx
+++ b/docs/phase-3/COSC336_Group6_Phase3_SRS_v1.2.docx
@@ -15368,7 +15368,7 @@
         <w:rPr>
           <w:sz w:val="21"/>
         </w:rPr>
-        <w:t>AI matching shall be compared with keyword and category search on the same requests and listings, reporting suitable matches within the first three results and unsuitable suggestions. Before testing, reviewers shall label suitability against the request’s mandatory constraints, independently of the AI output. Classification shall be checked against supplied metadata; sustainable actions, assistant answers and report summaries shall be checked against records, permitted workflows and calculation results.</w:t>
+        <w:t>AI matching shall be compared with keyword and category search on the same requests and listings, reporting suitable matches within the first three results and unsuitable suggestions. Before testing, reviewers shall label suitability against the request’s mandatory constraints, independently of the AI output. Classification shall be checked against supplied metadata. Sustainable actions, assistant answers and report summaries shall be checked against records, permitted workflows and calculation results.</w:t>
       </w:r>
       <w:r>
         <w:rPr>
@@ -15450,9 +15450,24 @@
       </w:r>
       <w:r>
         <w:rPr>
-          <w:sz w:val="21"/>
-        </w:rPr>
-        <w:t>Count accepted transferred units that fulfil a need explicitly identified by the requester or test scenario as otherwise requiring purchase. Gross avoided-purchase value = eligible units × stated replacement unit value. Do not assume every reuse prevented a purchase. Verify with worked cases including no purchase basis and partial receipt.</w:t>
+          <w:b w:val="0"/>
+          <w:sz w:val="21"/>
+        </w:rPr>
+        <w:t xml:space="preserve">Count accepted transferred units that fulfil a need explicitly identified by the requester or test scenario as otherwise requiring purchase. Gross avoided-purchase value = eligible units × stated replacement unit value. Do not assume every reuse prevented a purchase. </w:t>
+      </w:r>
+      <w:r>
+        <w:rPr>
+          <w:b/>
+          <w:sz w:val="21"/>
+        </w:rPr>
+        <w:t>Verify</w:t>
+      </w:r>
+      <w:r>
+        <w:rPr>
+          <w:b w:val="0"/>
+          <w:sz w:val="21"/>
+        </w:rPr>
+        <w:t xml:space="preserve"> with worked cases including no purchase basis and partial receipt.</w:t>
       </w:r>
     </w:p>
     <w:p>
@@ -15469,9 +15484,24 @@
       </w:r>
       <w:r>
         <w:rPr>
-          <w:sz w:val="21"/>
-        </w:rPr>
-        <w:t>For a declared disposal-risk cohort and period, count units or mass with a completed reuse, repair, donation, component-recovery or recycling outcome that avoids the disposal baseline. Diversion rate = diverted quantity ÷ (diverted + disposed quantity) × 100 for completed outcomes in that same cohort/period. Pending outcomes are reported separately and excluded from this denominator. Use one unit consistently; a zero denominator is N/A. Count each quantity once, even if repaired then transferred. Verify mixed, duplicate and pending outcomes.</w:t>
+          <w:b w:val="0"/>
+          <w:sz w:val="21"/>
+        </w:rPr>
+        <w:t xml:space="preserve">For a declared disposal-risk cohort and period, count units or mass with a completed reuse, repair, donation, component-recovery or recycling outcome that avoids the disposal baseline. Diversion rate = diverted quantity ÷ (diverted + disposed quantity) × 100 for completed outcomes in that same cohort/period. Pending outcomes are reported separately and excluded from this denominator. Use one unit consistently; a zero denominator is N/A. Count each quantity once, even if repaired then transferred. </w:t>
+      </w:r>
+      <w:r>
+        <w:rPr>
+          <w:b/>
+          <w:sz w:val="21"/>
+        </w:rPr>
+        <w:t>Verify</w:t>
+      </w:r>
+      <w:r>
+        <w:rPr>
+          <w:b w:val="0"/>
+          <w:sz w:val="21"/>
+        </w:rPr>
+        <w:t xml:space="preserve"> mixed, duplicate and pending outcomes.</w:t>
       </w:r>
     </w:p>
     <w:p>
@@ -15488,9 +15518,24 @@
       </w:r>
       <w:r>
         <w:rPr>
-          <w:sz w:val="21"/>
-        </w:rPr>
-        <w:t>Estimate avoided new-purchase emissions for eligible reuse units using stated replacement/emission factors; subtract relevant repair/transfer emissions where data exists and the selected method requires them. Declare boundary, units, factor sources, omissions and uncertainty. Missing essential factors produce unavailable results. Factor sources and values remain TBD-002. Verify against independently calculated examples; do not label an estimate as measured impact.</w:t>
+          <w:b w:val="0"/>
+          <w:sz w:val="21"/>
+        </w:rPr>
+        <w:t xml:space="preserve">Estimate avoided new-purchase emissions for eligible reuse units using stated replacement/emission factors; subtract relevant repair/transfer emissions where data exists and the selected method requires them. Declare boundary, units, factor sources, omissions and uncertainty. Missing essential factors produce unavailable results. Factor sources and values remain TBD-002. </w:t>
+      </w:r>
+      <w:r>
+        <w:rPr>
+          <w:b/>
+          <w:sz w:val="21"/>
+        </w:rPr>
+        <w:t>Verify</w:t>
+      </w:r>
+      <w:r>
+        <w:rPr>
+          <w:b w:val="0"/>
+          <w:sz w:val="21"/>
+        </w:rPr>
+        <w:t xml:space="preserve"> against independently calculated examples; do not label an estimate as measured impact.</w:t>
       </w:r>
     </w:p>
     <w:p>
@@ -15507,21 +15552,24 @@
       </w:r>
       <w:r>
         <w:rPr>
-          <w:sz w:val="21"/>
-        </w:rPr>
-        <w:t xml:space="preserve">Net savings = gross avoided-purchase value (SUS-001) minus relevant repair and handling/transport costs for that </w:t>
-      </w:r>
-      <w:r>
-        <w:rPr>
-          <w:sz w:val="21"/>
-        </w:rPr>
-        <w:t>fulfillment</w:t>
-      </w:r>
-      <w:r>
-        <w:rPr>
-          <w:sz w:val="21"/>
-        </w:rPr>
-        <w:t>. Allocate shared costs explicitly and once. Do not subtract unrelated costs or count the same avoided purchase twice. Verify single and partial-transfer examples, including negative savings.</w:t>
+          <w:b w:val="0"/>
+          <w:sz w:val="21"/>
+        </w:rPr>
+        <w:t xml:space="preserve">Net savings = gross avoided-purchase value (SUS-001) minus relevant repair and handling/transport costs for that fulfillment. Allocate shared costs explicitly and once. Do not subtract unrelated costs or count the same avoided purchase twice. </w:t>
+      </w:r>
+      <w:r>
+        <w:rPr>
+          <w:b/>
+          <w:sz w:val="21"/>
+        </w:rPr>
+        <w:t>Verify</w:t>
+      </w:r>
+      <w:r>
+        <w:rPr>
+          <w:b w:val="0"/>
+          <w:sz w:val="21"/>
+        </w:rPr>
+        <w:t xml:space="preserve"> single and partial-transfer examples, including negative savings.</w:t>
       </w:r>
     </w:p>
     <w:p>
@@ -15538,21 +15586,24 @@
       </w:r>
       <w:r>
         <w:rPr>
-          <w:sz w:val="21"/>
-        </w:rPr>
-        <w:t xml:space="preserve">Show completed transfer-event counts separately from accepted reused-unit counts, and completed repair-event counts separately from units restored to service. For a selected listing cohort, reuse rate = distinct eligible units whose internal transfer receipt is accepted during the reporting period ÷ distinct eligible units available for reuse during that period × 100. State the cohort and count each unit once; zero denominator is N/A. Repair does not count as reuse until a transfer is completed. Verify rates and counts against </w:t>
-      </w:r>
-      <w:r>
-        <w:rPr>
-          <w:sz w:val="21"/>
-        </w:rPr>
-        <w:t>labeled</w:t>
-      </w:r>
-      <w:r>
-        <w:rPr>
-          <w:sz w:val="21"/>
-        </w:rPr>
-        <w:t xml:space="preserve"> activity data.</w:t>
+          <w:b w:val="0"/>
+          <w:sz w:val="21"/>
+        </w:rPr>
+        <w:t xml:space="preserve">Show completed transfer-event counts separately from accepted reused-unit counts, and completed repair-event counts separately from units restored to service. For a selected listing cohort, reuse rate = distinct eligible units whose internal transfer receipt is accepted during the reporting period ÷ distinct eligible units available for reuse during that period × 100. State the cohort and count each unit once; zero denominator is N/A. Repair does not count as reuse until a transfer is completed. </w:t>
+      </w:r>
+      <w:r>
+        <w:rPr>
+          <w:b/>
+          <w:sz w:val="21"/>
+        </w:rPr>
+        <w:t>Verify</w:t>
+      </w:r>
+      <w:r>
+        <w:rPr>
+          <w:b w:val="0"/>
+          <w:sz w:val="21"/>
+        </w:rPr>
+        <w:t xml:space="preserve"> rates and counts against labeled activity data.</w:t>
       </w:r>
     </w:p>
     <w:p>
@@ -15569,9 +15620,24 @@
       </w:r>
       <w:r>
         <w:rPr>
-          <w:sz w:val="21"/>
-        </w:rPr>
-        <w:t>Estimate added service life through reuse/repair using declared assumptions and a stated baseline. The metric remains in prototype scope; its method is TBD-003. Display unavailable where the method or required inputs are absent, and keep service-life estimates distinct from measured outcomes. Verify the selected method and examples after design.</w:t>
+          <w:b w:val="0"/>
+          <w:sz w:val="21"/>
+        </w:rPr>
+        <w:t xml:space="preserve">Estimate added service life through reuse/repair using declared assumptions and a stated baseline. The metric remains in prototype scope; its method is TBD-003. Display unavailable where the method or required inputs are absent, and keep service-life estimates distinct from measured outcomes. </w:t>
+      </w:r>
+      <w:r>
+        <w:rPr>
+          <w:b/>
+          <w:sz w:val="21"/>
+        </w:rPr>
+        <w:t>Verify</w:t>
+      </w:r>
+      <w:r>
+        <w:rPr>
+          <w:b w:val="0"/>
+          <w:sz w:val="21"/>
+        </w:rPr>
+        <w:t xml:space="preserve"> the selected method and examples after design.</w:t>
       </w:r>
     </w:p>
     <w:p>
@@ -15588,9 +15654,24 @@
       </w:r>
       <w:r>
         <w:rPr>
-          <w:sz w:val="21"/>
-        </w:rPr>
-        <w:t>Retain inputs, methods, units, factors, sources and assumptions with results. Identify missing inputs rather than inventing values. Deduplicate unit/outcome cohorts and avoided purchases; retain links to supporting records. Distinguish event counts, physical quantities, rates and estimates. Verify missing-input, duplicate and denominator cases independently.</w:t>
+          <w:b w:val="0"/>
+          <w:sz w:val="21"/>
+        </w:rPr>
+        <w:t xml:space="preserve">Retain inputs, methods, units, factors, sources and assumptions with results. Identify missing inputs rather than inventing values. Deduplicate unit/outcome cohorts and avoided purchases; retain links to supporting records. Distinguish event counts, physical quantities, rates and estimates. </w:t>
+      </w:r>
+      <w:r>
+        <w:rPr>
+          <w:b/>
+          <w:sz w:val="21"/>
+        </w:rPr>
+        <w:t>Verify</w:t>
+      </w:r>
+      <w:r>
+        <w:rPr>
+          <w:b w:val="0"/>
+          <w:sz w:val="21"/>
+        </w:rPr>
+        <w:t xml:space="preserve"> missing-input, duplicate and denominator cases independently.</w:t>
       </w:r>
     </w:p>
     <w:p>

</xml_diff>

<commit_message>
Phase 3 SRS v1.2: identify Section 6.3 requirements and repair broken paragraphs
Give Section 6.3 the identifiers it was missing. Its two requirements are
normative and carry Verification clauses but had no ID, and Section 1.2 had
no prefix covering them. Adds DD-nnn to the conventions table and applies
DD-001 and DD-002.

Repair paragraphs damaged by an earlier edit. A helper joined new text onto
existing paragraphs with hard line breaks instead of creating paragraphs, and
reused runs carrying italic formatting the source never had. This rebuilds
Sections 1.2, 1.4 and 2.7 as plain paragraphs, restores the request quantity
equation that was dropped from Section 2.7, and corrects one British spelling
in a document that is otherwise American throughout.

Also fills the empty revision-history reason for 1.2.
</commit_message>
<xml_diff>
--- a/docs/phase-3/COSC336_Group6_Phase3_SRS_v1.2.docx
+++ b/docs/phase-3/COSC336_Group6_Phase3_SRS_v1.2.docx
@@ -5013,6 +5013,9 @@
                 <w:sz w:val="21"/>
               </w:rPr>
             </w:pPr>
+            <w:r>
+              <w:t>Revised Sections 1 to 6 for readability and traceability: tabulated the requirement prefixes, product scope and planning assumptions; mapped product functions to Section 4; labeled the privacy and data-delivery requirements; and aligned requirement formatting document-wide.</w:t>
+            </w:r>
           </w:p>
         </w:tc>
         <w:tc>
@@ -5590,7 +5593,7 @@
               <w:rPr>
                 <w:sz w:val="20"/>
               </w:rPr>
-              <w:t>BR-nnn</w:t>
+              <w:t>DD-nnn</w:t>
             </w:r>
           </w:p>
         </w:tc>
@@ -5613,7 +5616,7 @@
               <w:rPr>
                 <w:sz w:val="20"/>
               </w:rPr>
-              <w:t>Business rule (Section 5.5)</w:t>
+              <w:t>Data and delivery requirement (Section 6.3)</w:t>
             </w:r>
           </w:p>
         </w:tc>
@@ -5642,7 +5645,7 @@
               <w:rPr>
                 <w:sz w:val="20"/>
               </w:rPr>
-              <w:t>AD-nnn</w:t>
+              <w:t>BR-nnn</w:t>
             </w:r>
           </w:p>
         </w:tc>
@@ -5665,7 +5668,7 @@
               <w:rPr>
                 <w:sz w:val="20"/>
               </w:rPr>
-              <w:t>Assumption or dependency (Section 2.7)</w:t>
+              <w:t>Business rule (Section 5.5)</w:t>
             </w:r>
           </w:p>
         </w:tc>
@@ -5694,7 +5697,7 @@
               <w:rPr>
                 <w:sz w:val="20"/>
               </w:rPr>
-              <w:t>UC-nn</w:t>
+              <w:t>AD-nnn</w:t>
             </w:r>
           </w:p>
         </w:tc>
@@ -5717,7 +5720,7 @@
               <w:rPr>
                 <w:sz w:val="20"/>
               </w:rPr>
-              <w:t>Use case (Appendix B.4)</w:t>
+              <w:t>Assumption or dependency (Section 2.7)</w:t>
             </w:r>
           </w:p>
         </w:tc>
@@ -5746,6 +5749,58 @@
               <w:rPr>
                 <w:sz w:val="20"/>
               </w:rPr>
+              <w:t>UC-nn</w:t>
+            </w:r>
+          </w:p>
+        </w:tc>
+        <w:tc>
+          <w:tcPr>
+            <w:tcW w:w="7180" w:type="dxa"/>
+            <w:tcMar>
+              <w:top w:w="55" w:type="dxa"/>
+              <w:left w:w="90" w:type="dxa"/>
+              <w:bottom w:w="55" w:type="dxa"/>
+              <w:right w:w="90" w:type="dxa"/>
+            </w:tcMar>
+            <w:vAlign w:val="center"/>
+          </w:tcPr>
+          <w:p>
+            <w:pPr>
+              <w:spacing w:line="240" w:lineRule="exact"/>
+            </w:pPr>
+            <w:r>
+              <w:rPr>
+                <w:sz w:val="20"/>
+              </w:rPr>
+              <w:t>Use case (Appendix B.4)</w:t>
+            </w:r>
+          </w:p>
+        </w:tc>
+      </w:tr>
+      <w:tr>
+        <w:trPr>
+          <w:cantSplit/>
+          <w:jc w:val="center"/>
+        </w:trPr>
+        <w:tc>
+          <w:tcPr>
+            <w:tcW w:w="2900" w:type="dxa"/>
+            <w:tcMar>
+              <w:top w:w="55" w:type="dxa"/>
+              <w:left w:w="90" w:type="dxa"/>
+              <w:bottom w:w="55" w:type="dxa"/>
+              <w:right w:w="90" w:type="dxa"/>
+            </w:tcMar>
+            <w:vAlign w:val="center"/>
+          </w:tcPr>
+          <w:p>
+            <w:pPr>
+              <w:spacing w:line="240" w:lineRule="exact"/>
+            </w:pPr>
+            <w:r>
+              <w:rPr>
+                <w:sz w:val="20"/>
+              </w:rPr>
               <w:t>TBD-nnn</w:t>
             </w:r>
           </w:p>
@@ -5780,55 +5835,23 @@
         <w:spacing w:after="60" w:line="260" w:lineRule="exact"/>
       </w:pPr>
       <w:r>
-        <w:t>“</w:t>
-      </w:r>
-      <w:r>
-        <w:rPr>
-          <w:i/>
-          <w:iCs/>
-        </w:rPr>
-        <w:t>Shall</w:t>
-      </w:r>
-      <w:r>
-        <w:t>” states required behavior. Every requirement carries either an Acceptance or a Verification clause.</w:t>
-      </w:r>
-      <w:r>
-        <w:br/>
-      </w:r>
-      <w:r>
-        <w:br/>
-      </w:r>
-      <w:r>
-        <w:t xml:space="preserve">Requirements are labelled </w:t>
-      </w:r>
-      <w:r>
-        <w:rPr>
-          <w:i/>
-          <w:iCs/>
-        </w:rPr>
-        <w:t>Must</w:t>
-      </w:r>
-      <w:r>
-        <w:t xml:space="preserve"> or </w:t>
-      </w:r>
-      <w:r>
-        <w:rPr>
-          <w:i/>
-          <w:iCs/>
-        </w:rPr>
-        <w:t>Should</w:t>
-      </w:r>
-      <w:r>
-        <w:t>. Must requirements belong to the semester prototype. The three Should refinements are combined approvals (FR-TRANSFER-002), escalation routing (FR-TRANSFER-008), and a purchase indicator (FR-REQUEST-008).</w:t>
-      </w:r>
-      <w:r>
-        <w:br/>
-      </w:r>
-      <w:r>
-        <w:t>High and Medium indicate development order, not inclusion. All five AI functions remain required. Future enhancements are outside scope.</w:t>
-      </w:r>
-      <w:r>
-        <w:br/>
+        <w:t xml:space="preserve">“Shall” states required behavior. Every requirement carries either an Acceptance or a Verification clause.</w:t>
+      </w:r>
+    </w:p>
+    <w:p>
+      <w:pPr>
+        <w:spacing w:after="60" w:line="260" w:lineRule="exact"/>
+      </w:pPr>
+      <w:r>
+        <w:t xml:space="preserve">Requirements are labeled Must or Should. Must requirements belong to the semester prototype. The three Should refinements are combined approvals (FR-TRANSFER-002), escalation routing (FR-TRANSFER-008), and a purchase indicator (FR-REQUEST-008).</w:t>
+      </w:r>
+    </w:p>
+    <w:p>
+      <w:pPr>
+        <w:spacing w:after="60" w:line="260" w:lineRule="exact"/>
+      </w:pPr>
+      <w:r>
+        <w:t xml:space="preserve">High and Medium indicate development order, not inclusion. All five AI functions remain required. Future enhancements are outside scope.</w:t>
       </w:r>
     </w:p>
     <w:p>
@@ -6298,10 +6321,7 @@
         <w:spacing w:after="60" w:line="260" w:lineRule="exact"/>
       </w:pPr>
       <w:r>
-        <w:t>The platform connects departmental needs with available campus assets so that resources are reused rather than replaced. It maintains asset history through inspection, maintenance, repair, refurbishment and end-of-life decisions. Conventional workflows are extended by AI classification, semantic matching, sustainable-action advice, a conversational assistant and report summaries, with human approval and fallback to conventional workflows when AI is unavailable.</w:t>
-      </w:r>
-      <w:r>
-        <w:br/>
+        <w:t xml:space="preserve">The platform connects departmental needs with available campus assets so that resources are reused rather than replaced. It maintains asset history through inspection, maintenance, repair, refurbishment and end-of-life decisions. Conventional workflows are extended by AI classification, semantic matching, sustainable-action advice, a conversational assistant and report summaries, with human approval and fallback to conventional workflows when AI is unavailable.</w:t>
       </w:r>
     </w:p>
     <w:tbl>
@@ -6688,10 +6708,7 @@
         <w:spacing w:after="60" w:line="260" w:lineRule="exact"/>
       </w:pPr>
       <w:r>
-        <w:br/>
-      </w:r>
-      <w:r>
-        <w:t>The prototype uses synthetic data, so measured campus impact would require a real deployment. Possible later extensions are institutional or identity integration, and demand forecasting.</w:t>
+        <w:t xml:space="preserve">The prototype uses synthetic data, so measured campus impact would require a real deployment. Possible later extensions are institutional or identity integration, and demand forecasting.</w:t>
       </w:r>
     </w:p>
     <w:p>
@@ -9973,127 +9990,15 @@
         <w:spacing w:after="60" w:line="260" w:lineRule="exact"/>
       </w:pPr>
       <w:r>
-        <w:t>Quantity accounting</w:t>
-      </w:r>
-      <w:r>
-        <w:t>:</w:t>
-      </w:r>
-      <w:r>
-        <w:t xml:space="preserve"> Every unit a requester asks for is in exactly one of three states: </w:t>
-      </w:r>
-    </w:p>
-    <w:p>
-      <w:pPr>
-        <w:pStyle w:val="ListParagraph"/>
-        <w:numPr>
-          <w:ilvl w:val="0"/>
-          <w:numId w:val="1"/>
-        </w:numPr>
+        <w:t xml:space="preserve">Quantity accounting. Every unit a requester asks for is in exactly one of three states: accepted fulfillment, actively allocated to a confirmed reservation, or unallocated outstanding and still eligible for a further reservation. For an active request, requested = accepted fulfillment + actively allocated quantity + unallocated outstanding quantity. These terms are defined in Appendix A. A request is not complete while any unallocated outstanding quantity remains, and unmet needs remain visible to the Procurement Officer.</w:t>
+      </w:r>
+    </w:p>
+    <w:p>
+      <w:pPr>
         <w:spacing w:after="60" w:line="260" w:lineRule="exact"/>
       </w:pPr>
       <w:r>
-        <w:t>accepted fulfillment</w:t>
-      </w:r>
-    </w:p>
-    <w:p>
-      <w:pPr>
-        <w:pStyle w:val="ListParagraph"/>
-        <w:numPr>
-          <w:ilvl w:val="0"/>
-          <w:numId w:val="1"/>
-        </w:numPr>
-        <w:spacing w:after="60" w:line="260" w:lineRule="exact"/>
-      </w:pPr>
-      <w:r>
-        <w:t>actively allocated to a confirmed reservation</w:t>
-      </w:r>
-    </w:p>
-    <w:p>
-      <w:pPr>
-        <w:pStyle w:val="ListParagraph"/>
-        <w:numPr>
-          <w:ilvl w:val="0"/>
-          <w:numId w:val="1"/>
-        </w:numPr>
-        <w:spacing w:after="60" w:line="260" w:lineRule="exact"/>
-      </w:pPr>
-      <w:r>
-        <w:t>or unallocated outstanding and still eligible for a further reservation</w:t>
-      </w:r>
-    </w:p>
-    <w:p>
-      <w:pPr>
-        <w:spacing w:after="60" w:line="260" w:lineRule="exact"/>
-      </w:pPr>
-      <w:r>
-        <w:t>For an active request,</w:t>
-      </w:r>
-    </w:p>
-    <w:p>
-      <w:pPr>
-        <w:spacing w:after="60" w:line="260" w:lineRule="exact"/>
-        <w:rPr>
-          <w:sz w:val="24"/>
-          <w:szCs w:val="28"/>
-        </w:rPr>
-      </w:pPr>
-      <w:r>
-        <w:rPr>
-          <w:sz w:val="24"/>
-          <w:szCs w:val="28"/>
-        </w:rPr>
-        <w:t xml:space="preserve"> </w:t>
-      </w:r>
-      <m:oMath>
-        <m:r>
-          <w:rPr>
-            <w:rFonts w:ascii="Cambria Math" w:hAnsi="Cambria Math"/>
-          </w:rPr>
-          <m:t>requested=accepted fulfillment+actively allocated quantity+unallocated outstanding quantity</m:t>
-        </m:r>
-      </m:oMath>
-    </w:p>
-    <w:p>
-      <w:pPr>
-        <w:spacing w:after="60" w:line="260" w:lineRule="exact"/>
-      </w:pPr>
-      <w:r>
-        <w:t xml:space="preserve">These terms are defined in Appendix A. </w:t>
-      </w:r>
-      <w:r>
-        <w:t>The</w:t>
-      </w:r>
-      <w:r>
-        <w:t xml:space="preserve"> request is not complete while any unallocated outstanding quantity remains, and unmet needs remain visible to the Procurement Officer.</w:t>
-      </w:r>
-    </w:p>
-    <w:p>
-      <w:pPr>
-        <w:spacing w:after="60" w:line="260" w:lineRule="exact"/>
-      </w:pPr>
-      <w:r>
-        <w:br/>
-      </w:r>
-      <w:r>
-        <w:t>Custody</w:t>
-      </w:r>
-      <w:r>
-        <w:t>:</w:t>
-      </w:r>
-      <w:r>
-        <w:t xml:space="preserve"> Formal departmental custody is accountable assignment; physical holder and location track actual movement. </w:t>
-      </w:r>
-      <w:r>
-        <w:br/>
-      </w:r>
-      <w:r>
-        <w:t>Safety</w:t>
-      </w:r>
-      <w:r>
-        <w:t>:</w:t>
-      </w:r>
-      <w:r>
-        <w:t xml:space="preserve"> Rejection or cancellation cannot restore stock recorded as unsafe. Section 4 and Appendix B apply these prototype rules, and institutional delegation and retention remain TBD-006.</w:t>
+        <w:t xml:space="preserve">Custody. Formal departmental custody is accountable assignment; physical holder and location track actual movement. Safety. Rejection or cancellation cannot restore stock recorded as unsafe. Section 4 and Appendix B apply these prototype rules, and institutional delegation and retention remain TBD-006.</w:t>
       </w:r>
     </w:p>
     <w:p>
@@ -10134,7 +10039,7 @@
         <w:rPr>
           <w:b w:val="0"/>
         </w:rPr>
-        <w:t xml:space="preserve">The system shall provide sign-in, role-appropriate navigation, asset registration and editing, and marketplace search. It shall provide areas for request and reservation status, approvals, transfers and receipts, maintenance records, and sustainable-action review. Assistant interaction and reporting complete the set. Forms shall show required fields, preserve invalid input and explain correction steps (FR-ASSET-005, FR-REQUEST-002, NFR-QUAL-002). </w:t>
+        <w:t>The system shall provide sign-in, role-appropriate navigation, asset registration and editing, and marketplace search. It shall provide areas for request and reservation status, approvals, transfers and receipts, maintenance records, and sustainable-action review. Assistant interaction and reporting complete the set. Forms shall show required fields, preserve invalid input and explain correction steps (FR-ASSET-005, FR-REQUEST-002, NFR-QUAL-002).</w:t>
       </w:r>
       <w:r>
         <w:rPr>
@@ -10163,7 +10068,7 @@
         <w:rPr>
           <w:b w:val="0"/>
         </w:rPr>
-        <w:t xml:space="preserve">The system shall visibly distinguish confirmed asset data from AI suggestions, show processing/error states and uncertainty, and require user review before submitting assistant-prepared requests. Quantity and status views shall distinguish available, reserved, in-transit, received and unfit portions. </w:t>
+        <w:t>The system shall visibly distinguish confirmed asset data from AI suggestions, show processing/error states and uncertainty, and require user review before submitting assistant-prepared requests. Quantity and status views shall distinguish available, reserved, in-transit, received and unfit portions.</w:t>
       </w:r>
       <w:r>
         <w:rPr>
@@ -10228,7 +10133,7 @@
         <w:rPr>
           <w:b w:val="0"/>
         </w:rPr>
-        <w:t xml:space="preserve">The application shall exchange account/session data with its authentication service; asset, request, allocation, approval, transfer, maintenance and audit records with persistent storage; and asset files with file storage. The browser shall not receive service credentials. </w:t>
+        <w:t>The application shall exchange account/session data with its authentication service; asset, request, allocation, approval, transfer, maintenance and audit records with persistent storage; and asset files with file storage. The browser shall not receive service credentials.</w:t>
       </w:r>
       <w:r>
         <w:rPr>
@@ -10257,7 +10162,7 @@
         <w:rPr>
           <w:b w:val="0"/>
         </w:rPr>
-        <w:t xml:space="preserve">Server-side AI requests shall contain only task-required permitted information. Classification receives supplied asset metadata and files; matching receives request and listing data; action recommendations receive asset history, costs and demand; the assistant receives accessible records and policy; report summaries receive computed report data. Responses shall be treated as suggestions and validated before use. </w:t>
+        <w:t>Server-side AI requests shall contain only task-required permitted information. Classification receives supplied asset metadata and files; matching receives request and listing data; action recommendations receive asset history, costs and demand; the assistant receives accessible records and policy; report summaries receive computed report data. Responses shall be treated as suggestions and validated before use.</w:t>
       </w:r>
       <w:r>
         <w:rPr>
@@ -10298,7 +10203,7 @@
         <w:rPr>
           <w:b w:val="0"/>
         </w:rPr>
-        <w:t xml:space="preserve">Browser/server and external-service traffic shall use encrypted connections. Protected operations shall require authentication and authorization; transfer or reservation confirmations shall not be duplicated by a retry, and failures shall not leave partly applied records (NFR-SEC-001/002, NFR-QUAL-003). </w:t>
+        <w:t>Browser/server and external-service traffic shall use encrypted connections. Protected operations shall require authentication and authorization; transfer or reservation confirmations shall not be duplicated by a retry, and failures shall not leave partly applied records (NFR-SEC-001/002, NFR-QUAL-003).</w:t>
       </w:r>
       <w:r>
         <w:rPr>
@@ -10327,7 +10232,7 @@
         <w:rPr>
           <w:b w:val="0"/>
         </w:rPr>
-        <w:t xml:space="preserve">Notifications shall be in-application records with a permitted link and required action (FR-REPORT-006 to 008). Network or notification failure shall preserve saved business records and display an appropriate status. Email, SMS and live institutional messaging are not required prototype interfaces. </w:t>
+        <w:t>Notifications shall be in-application records with a permitted link and required action (FR-REPORT-006 to 008). Network or notification failure shall preserve saved business records and display an appropriate status. Email, SMS and live institutional messaging are not required prototype interfaces.</w:t>
       </w:r>
       <w:r>
         <w:rPr>
@@ -15691,7 +15596,28 @@
         <w:spacing w:after="60" w:line="260" w:lineRule="exact"/>
       </w:pPr>
       <w:r>
-        <w:t>The prototype shall include a reproducible synthetic starting dataset with consistent links among users, departments, assets, batch quantities, requests, allocations, approvals, transfers, maintenance and audit records. It shall support independently reproducible report and AI-evaluation examples, including partial allocations, returned/unfit items, missing inputs and competing approvals. Verification: reload the dataset and reproduce the declared test outcomes.</w:t>
+        <w:rPr>
+          <w:b/>
+        </w:rPr>
+        <w:t xml:space="preserve">DD-001  </w:t>
+      </w:r>
+      <w:r>
+        <w:rPr>
+          <w:b w:val="0"/>
+        </w:rPr>
+        <w:t>The prototype shall include a reproducible synthetic starting dataset with consistent links among users, departments, assets, batch quantities, requests, allocations, approvals, transfers, maintenance and audit records. It shall support independently reproducible report and AI-evaluation examples, including partial allocations, returned/unfit items, missing inputs and competing approvals.</w:t>
+      </w:r>
+      <w:r>
+        <w:rPr>
+          <w:b/>
+        </w:rPr>
+        <w:t xml:space="preserve"> Verification: </w:t>
+      </w:r>
+      <w:r>
+        <w:rPr>
+          <w:b w:val="0"/>
+        </w:rPr>
+        <w:t>reload the dataset and reproduce the declared test outcomes.</w:t>
       </w:r>
     </w:p>
     <w:p>
@@ -15699,8 +15625,28 @@
         <w:spacing w:after="60" w:line="260" w:lineRule="exact"/>
       </w:pPr>
       <w:r>
-        <w:lastRenderedPageBreak/>
-        <w:t>Setup and user documentation shall accompany the prototype as specified in Section 2.6 and NFR-QUAL-005. Dependency licences and hosted-service terms shall be respected; example photographs/documents shall be team-created or used with permission (Phase 2, Section 6.1). Verification: delivery checklist and licence/asset-source review. Any future use of real personal data requires institutional and applicable data-protection review; it is outside this synthetic-data submission.</w:t>
+        <w:rPr>
+          <w:b/>
+        </w:rPr>
+        <w:t xml:space="preserve">DD-002  </w:t>
+      </w:r>
+      <w:r>
+        <w:rPr>
+          <w:b w:val="0"/>
+        </w:rPr>
+        <w:t>Setup and user documentation shall accompany the prototype as specified in Section 2.6 and NFR-QUAL-005. Dependency licences and hosted-service terms shall be respected; example photographs/documents shall be team-created or used with permission (Phase 2, Section 6.1).</w:t>
+      </w:r>
+      <w:r>
+        <w:rPr>
+          <w:b/>
+        </w:rPr>
+        <w:t xml:space="preserve"> Verification: </w:t>
+      </w:r>
+      <w:r>
+        <w:rPr>
+          <w:b w:val="0"/>
+        </w:rPr>
+        <w:t>delivery checklist and licence/asset-source review. Any future use of real personal data requires institutional and applicable data-protection review; it is outside this synthetic-data submission.</w:t>
       </w:r>
     </w:p>
     <w:p>

</xml_diff>

<commit_message>
Phase 3 SRS v1.2: size both figures to the widened text column
Scale Figure 1 and Figure 2 to 175.3 mm so both fill the 177.8 mm text
column. This also removes an inconsistency where Figure 1 was 164.7 mm and
Figure 2 was 160.0 mm.

Text restored from the previous commit: a stale Word buffer had overwritten
Section 2.7 with the pre-repair fragmented paragraphs.
</commit_message>
<xml_diff>
--- a/docs/phase-3/COSC336_Group6_Phase3_SRS_v1.2.docx
+++ b/docs/phase-3/COSC336_Group6_Phase3_SRS_v1.2.docx
@@ -16749,7 +16749,7 @@
         </w:rPr>
         <w:drawing>
           <wp:inline distT="0" distB="0" distL="0" distR="0" wp14:anchorId="5D3B2778" wp14:editId="00C766A2">
-            <wp:extent cx="5930900" cy="6502303"/>
+            <wp:extent cx="6309397" cy="6917266"/>
             <wp:effectExtent l="0" t="0" r="0" b="0"/>
             <wp:docPr id="1" name="Picture 1" descr="Figure 1 Use case diagram with system boundary and supporting actors"/>
             <wp:cNvGraphicFramePr>
@@ -16771,7 +16771,7 @@
                   <pic:spPr>
                     <a:xfrm>
                       <a:off x="0" y="0"/>
-                      <a:ext cx="5938212" cy="6510320"/>
+                      <a:ext cx="6309397" cy="6917266"/>
                     </a:xfrm>
                     <a:prstGeom prst="rect">
                       <a:avLst/>
@@ -16828,7 +16828,7 @@
         </w:rPr>
         <w:drawing>
           <wp:inline distT="0" distB="0" distL="0" distR="0" wp14:anchorId="015971EE" wp14:editId="5F747546">
-            <wp:extent cx="5760720" cy="5479872"/>
+            <wp:extent cx="6310745" cy="6003082"/>
             <wp:effectExtent l="0" t="0" r="0" b="0"/>
             <wp:docPr id="2" name="Picture 2" descr="Figure 2 Asset state model with guarded receipt return and prior-state rejection outcomes"/>
             <wp:cNvGraphicFramePr>
@@ -16850,7 +16850,7 @@
                   <pic:spPr>
                     <a:xfrm>
                       <a:off x="0" y="0"/>
-                      <a:ext cx="5760720" cy="5479872"/>
+                      <a:ext cx="6310745" cy="6003082"/>
                     </a:xfrm>
                     <a:prstGeom prst="rect">
                       <a:avLst/>

</xml_diff>